<commit_message>
docs(frontend): regenerate combined doc with corrected BPU/IBuffer descriptions
</commit_message>
<xml_diff>
--- a/src/main/scala/xiangshan/frontend/doc/frontend_combined.docx
+++ b/src/main/scala/xiangshan/frontend/doc/frontend_combined.docx
@@ -336,7 +336,7 @@
           </w:tcPr>
           <w:p>
             <w:r>
-              <w:t>16 or 32</w:t>
+              <w:t>32 (HasCExtension=true), else 16</w:t>
             </w:r>
           </w:p>
         </w:tc>
@@ -1029,7 +1029,7 @@
           <w:rFonts w:ascii="Courier New" w:hAnsi="Courier New"/>
           <w:sz w:val="16"/>
         </w:rPr>
-        <w:t xml:space="preserve">  |  IBufNBank=6 banked FIFO        |      |  PMP+Checker     |</w:t>
+        <w:t xml:space="preserve">  |  ReadBanks=8, WriteBanks=4      |      |  PMP+Checker     |</w:t>
       </w:r>
     </w:p>
     <w:p>
@@ -1173,7 +1173,7 @@
           <w:rFonts w:ascii="Courier New" w:hAnsi="Courier New"/>
           <w:sz w:val="16"/>
         </w:rPr>
-        <w:t xml:space="preserve">  FtqSize=64, IBuffer.Size=48, IBufNBank=6, FetchBlockInstNum=16</w:t>
+        <w:t xml:space="preserve">  FtqSize=64, IBuffer.Size=48, IBuffer(read=8, write=4), FetchBlockInstNum=32</w:t>
       </w:r>
     </w:p>
     <w:p>
@@ -5811,7 +5811,7 @@
     </w:p>
     <w:p>
       <w:r>
-        <w:t>Role: 3-stage branch prediction pipeline. S1 (uBTB+ABTB+uTAGE), S2 (MBTB+TAGE+SC), S3 (MBTB-latched+ITTAGE+RAS). Each stage sends predictions to FTQ; a later stage overrides FTQ if its result differs from S1. Location: Frontend.scala → Module(new Predictor) inside FrontendInlinedImp. Pipeline: 3 register stages (S1/S2/S3); S0 is the combinational launch phase.</w:t>
+        <w:t>Role: 3-stage branch prediction pipeline. S1 (uBTB+ABTB+uTAGE), S2 (MBTB+TAGE+SC), S3 (MBTB-latched+ITTAGE+RAS). FTQ receives S1 prediction, and S3 sends override updates only when it differs from S1. Location: Frontend.scala → Module(new Predictor) inside FrontendInlinedImp. Pipeline: 3 register stages (S1/S2/S3); S0 is the combinational launch phase.</w:t>
       </w:r>
     </w:p>
     <w:p>
@@ -6294,7 +6294,7 @@
           </w:tcPr>
           <w:p>
             <w:r>
-              <w:t>Prediction result → FTQ (s1/s2/s3)</w:t>
+              <w:t>Prediction result → FTQ (S1 new enqueue or S3 override update)</w:t>
             </w:r>
           </w:p>
         </w:tc>
@@ -12627,7 +12627,7 @@
           </w:tcPr>
           <w:p>
             <w:r>
-              <w:t>XSCoreParamsKey.IBufSize</w:t>
+              <w:t>IBufferParameters.Size</w:t>
             </w:r>
           </w:p>
         </w:tc>
@@ -12647,7 +12647,7 @@
           </w:tcPr>
           <w:p>
             <w:r>
-              <w:t>Total buffer entries (IBufNBank × bankSize)</w:t>
+              <w:t>Total buffer entries</w:t>
             </w:r>
           </w:p>
         </w:tc>
@@ -12659,37 +12659,37 @@
           </w:tcPr>
           <w:p>
             <w:r>
-              <w:t>IBufNBank</w:t>
-            </w:r>
-          </w:p>
-        </w:tc>
-        <w:tc>
-          <w:tcPr>
-            <w:tcW w:type="dxa" w:w="2160"/>
-          </w:tcPr>
-          <w:p>
-            <w:r>
-              <w:t>XSCoreParamsKey.IBufNBank</w:t>
-            </w:r>
-          </w:p>
-        </w:tc>
-        <w:tc>
-          <w:tcPr>
-            <w:tcW w:type="dxa" w:w="2160"/>
-          </w:tcPr>
-          <w:p>
-            <w:r>
-              <w:t>6</w:t>
-            </w:r>
-          </w:p>
-        </w:tc>
-        <w:tc>
-          <w:tcPr>
-            <w:tcW w:type="dxa" w:w="2160"/>
-          </w:tcPr>
-          <w:p>
-            <w:r>
-              <w:t>Bank count (≥ DecodeWidth required)</w:t>
+              <w:t>NumWriteBank</w:t>
+            </w:r>
+          </w:p>
+        </w:tc>
+        <w:tc>
+          <w:tcPr>
+            <w:tcW w:type="dxa" w:w="2160"/>
+          </w:tcPr>
+          <w:p>
+            <w:r>
+              <w:t>IBufferParameters.NumWriteBank</w:t>
+            </w:r>
+          </w:p>
+        </w:tc>
+        <w:tc>
+          <w:tcPr>
+            <w:tcW w:type="dxa" w:w="2160"/>
+          </w:tcPr>
+          <w:p>
+            <w:r>
+              <w:t>4</w:t>
+            </w:r>
+          </w:p>
+        </w:tc>
+        <w:tc>
+          <w:tcPr>
+            <w:tcW w:type="dxa" w:w="2160"/>
+          </w:tcPr>
+          <w:p>
+            <w:r>
+              <w:t>Write-bank count (enqueue datapath)</w:t>
             </w:r>
           </w:p>
         </w:tc>
@@ -12701,37 +12701,37 @@
           </w:tcPr>
           <w:p>
             <w:r>
-              <w:t>PredictWidth</w:t>
-            </w:r>
-          </w:p>
-        </w:tc>
-        <w:tc>
-          <w:tcPr>
-            <w:tcW w:type="dxa" w:w="2160"/>
-          </w:tcPr>
-          <w:p>
-            <w:r>
-              <w:t>HasXSParameter.PredictWidth</w:t>
-            </w:r>
-          </w:p>
-        </w:tc>
-        <w:tc>
-          <w:tcPr>
-            <w:tcW w:type="dxa" w:w="2160"/>
-          </w:tcPr>
-          <w:p>
-            <w:r>
-              <w:t>16</w:t>
-            </w:r>
-          </w:p>
-        </w:tc>
-        <w:tc>
-          <w:tcPr>
-            <w:tcW w:type="dxa" w:w="2160"/>
-          </w:tcPr>
-          <w:p>
-            <w:r>
-              <w:t>Max enqueue instructions per cycle</w:t>
+              <w:t>NumReadBank</w:t>
+            </w:r>
+          </w:p>
+        </w:tc>
+        <w:tc>
+          <w:tcPr>
+            <w:tcW w:type="dxa" w:w="2160"/>
+          </w:tcPr>
+          <w:p>
+            <w:r>
+              <w:t>IBufferParameters.NumReadBank</w:t>
+            </w:r>
+          </w:p>
+        </w:tc>
+        <w:tc>
+          <w:tcPr>
+            <w:tcW w:type="dxa" w:w="2160"/>
+          </w:tcPr>
+          <w:p>
+            <w:r>
+              <w:t>8</w:t>
+            </w:r>
+          </w:p>
+        </w:tc>
+        <w:tc>
+          <w:tcPr>
+            <w:tcW w:type="dxa" w:w="2160"/>
+          </w:tcPr>
+          <w:p>
+            <w:r>
+              <w:t>Read-bank count (must be ≥ DecodeWidth)</w:t>
             </w:r>
           </w:p>
         </w:tc>
@@ -12743,37 +12743,37 @@
           </w:tcPr>
           <w:p>
             <w:r>
-              <w:t>DecodeWidth</w:t>
-            </w:r>
-          </w:p>
-        </w:tc>
-        <w:tc>
-          <w:tcPr>
-            <w:tcW w:type="dxa" w:w="2160"/>
-          </w:tcPr>
-          <w:p>
-            <w:r>
-              <w:t>XSCoreParamsKey.DecodeWidth</w:t>
-            </w:r>
-          </w:p>
-        </w:tc>
-        <w:tc>
-          <w:tcPr>
-            <w:tcW w:type="dxa" w:w="2160"/>
-          </w:tcPr>
-          <w:p>
-            <w:r>
-              <w:t>6</w:t>
-            </w:r>
-          </w:p>
-        </w:tc>
-        <w:tc>
-          <w:tcPr>
-            <w:tcW w:type="dxa" w:w="2160"/>
-          </w:tcPr>
-          <w:p>
-            <w:r>
-              <w:t>Max dequeue instructions per cycle</w:t>
+              <w:t>PredictWidth</w:t>
+            </w:r>
+          </w:p>
+        </w:tc>
+        <w:tc>
+          <w:tcPr>
+            <w:tcW w:type="dxa" w:w="2160"/>
+          </w:tcPr>
+          <w:p>
+            <w:r>
+              <w:t>HasXSParameter.PredictWidth</w:t>
+            </w:r>
+          </w:p>
+        </w:tc>
+        <w:tc>
+          <w:tcPr>
+            <w:tcW w:type="dxa" w:w="2160"/>
+          </w:tcPr>
+          <w:p>
+            <w:r>
+              <w:t>16</w:t>
+            </w:r>
+          </w:p>
+        </w:tc>
+        <w:tc>
+          <w:tcPr>
+            <w:tcW w:type="dxa" w:w="2160"/>
+          </w:tcPr>
+          <w:p>
+            <w:r>
+              <w:t>Max enqueue instructions per cycle</w:t>
             </w:r>
           </w:p>
         </w:tc>
@@ -12785,37 +12785,121 @@
           </w:tcPr>
           <w:p>
             <w:r>
-              <w:t>bankSize</w:t>
-            </w:r>
-          </w:p>
-        </w:tc>
-        <w:tc>
-          <w:tcPr>
-            <w:tcW w:type="dxa" w:w="2160"/>
-          </w:tcPr>
-          <w:p>
-            <w:r>
-              <w:t>IBufSize / IBufNBank</w:t>
-            </w:r>
-          </w:p>
-        </w:tc>
-        <w:tc>
-          <w:tcPr>
-            <w:tcW w:type="dxa" w:w="2160"/>
-          </w:tcPr>
-          <w:p>
-            <w:r>
-              <w:t>8</w:t>
-            </w:r>
-          </w:p>
-        </w:tc>
-        <w:tc>
-          <w:tcPr>
-            <w:tcW w:type="dxa" w:w="2160"/>
-          </w:tcPr>
-          <w:p>
-            <w:r>
-              <w:t>Entries per bank</w:t>
+              <w:t>DecodeWidth</w:t>
+            </w:r>
+          </w:p>
+        </w:tc>
+        <w:tc>
+          <w:tcPr>
+            <w:tcW w:type="dxa" w:w="2160"/>
+          </w:tcPr>
+          <w:p>
+            <w:r>
+              <w:t>XSCoreParamsKey.DecodeWidth</w:t>
+            </w:r>
+          </w:p>
+        </w:tc>
+        <w:tc>
+          <w:tcPr>
+            <w:tcW w:type="dxa" w:w="2160"/>
+          </w:tcPr>
+          <w:p>
+            <w:r>
+              <w:t>6</w:t>
+            </w:r>
+          </w:p>
+        </w:tc>
+        <w:tc>
+          <w:tcPr>
+            <w:tcW w:type="dxa" w:w="2160"/>
+          </w:tcPr>
+          <w:p>
+            <w:r>
+              <w:t>Max dequeue instructions per cycle</w:t>
+            </w:r>
+          </w:p>
+        </w:tc>
+      </w:tr>
+      <w:tr>
+        <w:tc>
+          <w:tcPr>
+            <w:tcW w:type="dxa" w:w="2160"/>
+          </w:tcPr>
+          <w:p>
+            <w:r>
+              <w:t>ReadBankSize</w:t>
+            </w:r>
+          </w:p>
+        </w:tc>
+        <w:tc>
+          <w:tcPr>
+            <w:tcW w:type="dxa" w:w="2160"/>
+          </w:tcPr>
+          <w:p>
+            <w:r>
+              <w:t>IBufSize / NumReadBank</w:t>
+            </w:r>
+          </w:p>
+        </w:tc>
+        <w:tc>
+          <w:tcPr>
+            <w:tcW w:type="dxa" w:w="2160"/>
+          </w:tcPr>
+          <w:p>
+            <w:r>
+              <w:t>6</w:t>
+            </w:r>
+          </w:p>
+        </w:tc>
+        <w:tc>
+          <w:tcPr>
+            <w:tcW w:type="dxa" w:w="2160"/>
+          </w:tcPr>
+          <w:p>
+            <w:r>
+              <w:t>Entries per read bank</w:t>
+            </w:r>
+          </w:p>
+        </w:tc>
+      </w:tr>
+      <w:tr>
+        <w:tc>
+          <w:tcPr>
+            <w:tcW w:type="dxa" w:w="2160"/>
+          </w:tcPr>
+          <w:p>
+            <w:r>
+              <w:t>WriteBankSize</w:t>
+            </w:r>
+          </w:p>
+        </w:tc>
+        <w:tc>
+          <w:tcPr>
+            <w:tcW w:type="dxa" w:w="2160"/>
+          </w:tcPr>
+          <w:p>
+            <w:r>
+              <w:t>IBufSize / NumWriteBank</w:t>
+            </w:r>
+          </w:p>
+        </w:tc>
+        <w:tc>
+          <w:tcPr>
+            <w:tcW w:type="dxa" w:w="2160"/>
+          </w:tcPr>
+          <w:p>
+            <w:r>
+              <w:t>12</w:t>
+            </w:r>
+          </w:p>
+        </w:tc>
+        <w:tc>
+          <w:tcPr>
+            <w:tcW w:type="dxa" w:w="2160"/>
+          </w:tcPr>
+          <w:p>
+            <w:r>
+              <w:t>Entries per write bank</w:t>
             </w:r>
           </w:p>
         </w:tc>
@@ -12823,7 +12907,7 @@
     </w:tbl>
     <w:p>
       <w:r>
-        <w:t>Constraints: IBufSize % IBufNBank == 0;  IBufNBank &gt;= DecodeWidth</w:t>
+        <w:t>Constraints: IBufSize % NumWriteBank == 0; IBufSize % NumReadBank == 0; NumReadBank &gt;= DecodeWidth</w:t>
       </w:r>
     </w:p>
     <w:p>
@@ -13248,7 +13332,7 @@
           <w:rFonts w:ascii="Courier New" w:hAnsi="Courier New"/>
           <w:sz w:val="16"/>
         </w:rPr>
-        <w:t xml:space="preserve">  IBufSize=48, IBufNBank=6, bankSize=8</w:t>
+        <w:t xml:space="preserve">  IBufSize=48, NumReadBank=8, ReadBankSize=6, NumWriteBank=4, WriteBankSize=12</w:t>
       </w:r>
     </w:p>
     <w:p>
@@ -13296,67 +13380,91 @@
           <w:rFonts w:ascii="Courier New" w:hAnsi="Courier New"/>
           <w:sz w:val="16"/>
         </w:rPr>
-        <w:t xml:space="preserve">    Bank 0: ibuf[0, 6, 12, 18, 24, 30, 36, 42]</w:t>
-      </w:r>
-    </w:p>
-    <w:p>
-      <w:pPr>
-        <w:pStyle w:val="NoSpacing"/>
-      </w:pPr>
-      <w:r>
-        <w:rPr>
-          <w:rFonts w:ascii="Courier New" w:hAnsi="Courier New"/>
-          <w:sz w:val="16"/>
-        </w:rPr>
-        <w:t xml:space="preserve">    Bank 1: ibuf[1, 7, 13, 19, 25, 31, 37, 43]</w:t>
-      </w:r>
-    </w:p>
-    <w:p>
-      <w:pPr>
-        <w:pStyle w:val="NoSpacing"/>
-      </w:pPr>
-      <w:r>
-        <w:rPr>
-          <w:rFonts w:ascii="Courier New" w:hAnsi="Courier New"/>
-          <w:sz w:val="16"/>
-        </w:rPr>
-        <w:t xml:space="preserve">    Bank 2: ibuf[2, 8, 14, 20, 26, 32, 38, 44]</w:t>
-      </w:r>
-    </w:p>
-    <w:p>
-      <w:pPr>
-        <w:pStyle w:val="NoSpacing"/>
-      </w:pPr>
-      <w:r>
-        <w:rPr>
-          <w:rFonts w:ascii="Courier New" w:hAnsi="Courier New"/>
-          <w:sz w:val="16"/>
-        </w:rPr>
-        <w:t xml:space="preserve">    Bank 3: ibuf[3, 9, 15, 21, 27, 33, 39, 45]</w:t>
-      </w:r>
-    </w:p>
-    <w:p>
-      <w:pPr>
-        <w:pStyle w:val="NoSpacing"/>
-      </w:pPr>
-      <w:r>
-        <w:rPr>
-          <w:rFonts w:ascii="Courier New" w:hAnsi="Courier New"/>
-          <w:sz w:val="16"/>
-        </w:rPr>
-        <w:t xml:space="preserve">    Bank 4: ibuf[4,10, 16, 22, 28, 34, 40, 46]</w:t>
-      </w:r>
-    </w:p>
-    <w:p>
-      <w:pPr>
-        <w:pStyle w:val="NoSpacing"/>
-      </w:pPr>
-      <w:r>
-        <w:rPr>
-          <w:rFonts w:ascii="Courier New" w:hAnsi="Courier New"/>
-          <w:sz w:val="16"/>
-        </w:rPr>
-        <w:t xml:space="preserve">    Bank 5: ibuf[5,11, 17, 23, 29, 35, 41, 47]</w:t>
+        <w:t xml:space="preserve">    Bank 0: ibuf[0, 8, 16, 24, 32, 40]</w:t>
+      </w:r>
+    </w:p>
+    <w:p>
+      <w:pPr>
+        <w:pStyle w:val="NoSpacing"/>
+      </w:pPr>
+      <w:r>
+        <w:rPr>
+          <w:rFonts w:ascii="Courier New" w:hAnsi="Courier New"/>
+          <w:sz w:val="16"/>
+        </w:rPr>
+        <w:t xml:space="preserve">    Bank 1: ibuf[1, 9, 17, 25, 33, 41]</w:t>
+      </w:r>
+    </w:p>
+    <w:p>
+      <w:pPr>
+        <w:pStyle w:val="NoSpacing"/>
+      </w:pPr>
+      <w:r>
+        <w:rPr>
+          <w:rFonts w:ascii="Courier New" w:hAnsi="Courier New"/>
+          <w:sz w:val="16"/>
+        </w:rPr>
+        <w:t xml:space="preserve">    Bank 2: ibuf[2,10, 18, 26, 34, 42]</w:t>
+      </w:r>
+    </w:p>
+    <w:p>
+      <w:pPr>
+        <w:pStyle w:val="NoSpacing"/>
+      </w:pPr>
+      <w:r>
+        <w:rPr>
+          <w:rFonts w:ascii="Courier New" w:hAnsi="Courier New"/>
+          <w:sz w:val="16"/>
+        </w:rPr>
+        <w:t xml:space="preserve">    Bank 3: ibuf[3,11, 19, 27, 35, 43]</w:t>
+      </w:r>
+    </w:p>
+    <w:p>
+      <w:pPr>
+        <w:pStyle w:val="NoSpacing"/>
+      </w:pPr>
+      <w:r>
+        <w:rPr>
+          <w:rFonts w:ascii="Courier New" w:hAnsi="Courier New"/>
+          <w:sz w:val="16"/>
+        </w:rPr>
+        <w:t xml:space="preserve">    Bank 4: ibuf[4,12, 20, 28, 36, 44]</w:t>
+      </w:r>
+    </w:p>
+    <w:p>
+      <w:pPr>
+        <w:pStyle w:val="NoSpacing"/>
+      </w:pPr>
+      <w:r>
+        <w:rPr>
+          <w:rFonts w:ascii="Courier New" w:hAnsi="Courier New"/>
+          <w:sz w:val="16"/>
+        </w:rPr>
+        <w:t xml:space="preserve">    Bank 5: ibuf[5,13, 21, 29, 37, 45]</w:t>
+      </w:r>
+    </w:p>
+    <w:p>
+      <w:pPr>
+        <w:pStyle w:val="NoSpacing"/>
+      </w:pPr>
+      <w:r>
+        <w:rPr>
+          <w:rFonts w:ascii="Courier New" w:hAnsi="Courier New"/>
+          <w:sz w:val="16"/>
+        </w:rPr>
+        <w:t xml:space="preserve">    Bank 6: ibuf[6,14, 22, 30, 38, 46]</w:t>
+      </w:r>
+    </w:p>
+    <w:p>
+      <w:pPr>
+        <w:pStyle w:val="NoSpacing"/>
+      </w:pPr>
+      <w:r>
+        <w:rPr>
+          <w:rFonts w:ascii="Courier New" w:hAnsi="Courier New"/>
+          <w:sz w:val="16"/>
+        </w:rPr>
+        <w:t xml:space="preserve">    Bank 7: ibuf[7,15, 23, 31, 39, 47]</w:t>
       </w:r>
     </w:p>
     <w:p>
@@ -13404,7 +13512,7 @@
           <w:rFonts w:ascii="Courier New" w:hAnsi="Courier New"/>
           <w:sz w:val="16"/>
         </w:rPr>
-        <w:t xml:space="preserve">    Stage 2: each output slot selects from IBufNBank candidates (IBufNBank:1 Mux)</w:t>
+        <w:t xml:space="preserve">    Stage 2: each output slot selects from NumReadBank candidates (NumReadBank:1 Mux)</w:t>
       </w:r>
     </w:p>
     <w:p>
@@ -13500,19 +13608,19 @@
           <w:rFonts w:ascii="Courier New" w:hAnsi="Courier New"/>
           <w:sz w:val="16"/>
         </w:rPr>
-        <w:t xml:space="preserve">    allowEnq = (IBufSize - PredictWidth) &gt;= numValidNext</w:t>
-      </w:r>
-    </w:p>
-    <w:p>
-      <w:pPr>
-        <w:pStyle w:val="NoSpacing"/>
-      </w:pPr>
-      <w:r>
-        <w:rPr>
-          <w:rFonts w:ascii="Courier New" w:hAnsi="Courier New"/>
-          <w:sz w:val="16"/>
-        </w:rPr>
-        <w:t xml:space="preserve">    (PredictWidth=16 margin to prevent overflow)</w:t>
+        <w:t xml:space="preserve">    allowEnq := prevInstrCount &lt; nextNumInvalid</w:t>
+      </w:r>
+    </w:p>
+    <w:p>
+      <w:pPr>
+        <w:pStyle w:val="NoSpacing"/>
+      </w:pPr>
+      <w:r>
+        <w:rPr>
+          <w:rFonts w:ascii="Courier New" w:hAnsi="Courier New"/>
+          <w:sz w:val="16"/>
+        </w:rPr>
+        <w:t xml:space="preserve">    (ready is registered and uses previous IFU enqueue demand)</w:t>
       </w:r>
     </w:p>
     <w:p>
@@ -13537,7 +13645,7 @@
     </w:p>
     <w:p>
       <w:r>
-        <w:t>numFromFetch = PopCount(io.in.bits.enqEnable). enqOffset(i) = PopCount(io.in.bits.valid.take(i)) — computes each instruction's write slot. Bypass: when enqPtr==deqPtr &amp;&amp; decodeCanAccept, the first DecodeWidth instructions are forwarded directly to OutputEntries; only the remainder is written to ibuf registers. Full guard: allowEnq = (IBufSize - PredictWidth) &gt;= numValidNext (PredictWidth margin).</w:t>
+        <w:t>numFromFetch = PopCount(io.in.bits.enqEnable). enqOffset(i) = PopCount(io.in.bits.valid.take(i)) — computes each instruction's write slot. Bypass: when enqPtr==deqPtr &amp;&amp; decodeCanAccept, the first DecodeWidth instructions are forwarded directly to OutputEntries; only the remainder is written to ibuf registers. Full guard: allowEnq := prevInstrCount &lt; nextNumInvalid (registered ready logic).</w:t>
       </w:r>
     </w:p>
     <w:p>
@@ -13550,7 +13658,7 @@
     </w:p>
     <w:p>
       <w:r>
-        <w:t>Stage 1: Each bank selects 1 entry via bankSize:1 Mux (deqInBankPtr index). Stage 2: Each output slot selects from IBufNBank results via IBufNBank:1 Mux (deqBankPtr index). DecodeWidth=6 reads each come from a different bank → no structural hazard.</w:t>
+        <w:t>Stage 1: Each bank selects 1 entry via bankSize:1 Mux (deqInBankPtr index). Stage 2: Each output slot selects from NumReadBank results via NumReadBank:1 Mux (deqBankPtr index). DecodeWidth=6 reads each come from a different bank → no structural hazard.</w:t>
       </w:r>
     </w:p>
     <w:p>
@@ -14012,7 +14120,7 @@
           </w:tcPr>
           <w:p>
             <w:r>
-              <w:t>Stage1: bankSize:1 Mux × IBufNBank; Stage2: IBufNBank:1 Mux × DecodeWidth</w:t>
+              <w:t>Stage1: ReadBankSize:1 Mux × NumReadBank; Stage2: NumReadBank:1 Mux × DecodeWidth</w:t>
             </w:r>
           </w:p>
         </w:tc>
@@ -14068,7 +14176,7 @@
           </w:tcPr>
           <w:p>
             <w:r>
-              <w:t>numValidNext → allowEnq</w:t>
+              <w:t>nextNumInvalid → allowEnq</w:t>
             </w:r>
           </w:p>
         </w:tc>
@@ -14078,7 +14186,7 @@
           </w:tcPr>
           <w:p>
             <w:r>
-              <w:t>Addition + comparison — on io.in.ready critical path</w:t>
+              <w:t>allowEnq := prevInstrCount &lt; nextNumInvalid (registered ready path)</w:t>
             </w:r>
           </w:p>
         </w:tc>

</xml_diff>